<commit_message>
Updated to template Chinese font size
</commit_message>
<xml_diff>
--- a/Front Matter/Template/6_Front-Matter_Template-v4.docx
+++ b/Front Matter/Template/6_Front-Matter_Template-v4.docx
@@ -43,20 +43,86 @@
         <w:rPr>
           <w:rFonts w:ascii="Noto Serif" w:eastAsia="Noto Serif SC" w:hAnsi="Noto Serif" w:cs="Noto Serif"/>
           <w:b/>
-          <w:sz w:val="56"/>
-          <w:szCs w:val="96"/>
-          <w:lang w:val="en-US"/>
-        </w:rPr>
-      </w:pPr>
-      <w:r>
-        <w:rPr>
-          <w:rFonts w:ascii="Noto Serif" w:eastAsia="Noto Serif SC" w:hAnsi="Noto Serif" w:cs="Noto Serif" w:hint="eastAsia"/>
+          <w:sz w:val="60"/>
+          <w:szCs w:val="60"/>
+          <w:lang w:val="en-US"/>
+        </w:rPr>
+      </w:pPr>
+      <w:r>
+        <w:rPr>
+          <w:rFonts w:ascii="Noto Serif" w:eastAsia="Noto Serif SC" w:hAnsi="Noto Serif" w:cs="Noto Serif" w:hint="eastAsia"/>
+          <w:b/>
+          <w:sz w:val="60"/>
+          <w:szCs w:val="60"/>
+        </w:rPr>
+        <w:t>山</w:t>
+      </w:r>
+      <w:r>
+        <w:rPr>
+          <w:rFonts w:ascii="Noto Serif" w:eastAsia="Noto Serif SC" w:hAnsi="Noto Serif" w:cs="Noto Serif" w:hint="eastAsia"/>
+          <w:b/>
+          <w:sz w:val="60"/>
+          <w:szCs w:val="60"/>
+        </w:rPr>
+        <w:t xml:space="preserve"> </w:t>
+      </w:r>
+      <w:r>
+        <w:rPr>
+          <w:rFonts w:ascii="Noto Serif" w:eastAsia="Noto Serif SC" w:hAnsi="Noto Serif" w:cs="Noto Serif" w:hint="eastAsia"/>
+          <w:b/>
+          <w:sz w:val="60"/>
+          <w:szCs w:val="60"/>
+        </w:rPr>
+        <w:t>谣</w:t>
+      </w:r>
+      <w:r>
+        <w:rPr>
+          <w:rFonts w:ascii="Noto Serif" w:eastAsia="Noto Serif SC" w:hAnsi="Noto Serif" w:cs="Noto Serif" w:hint="eastAsia"/>
+          <w:b/>
+          <w:sz w:val="60"/>
+          <w:szCs w:val="60"/>
+        </w:rPr>
+        <w:t xml:space="preserve"> </w:t>
+      </w:r>
+      <w:r>
+        <w:rPr>
+          <w:rFonts w:ascii="Noto Serif" w:eastAsia="Noto Serif SC" w:hAnsi="Noto Serif" w:cs="Noto Serif" w:hint="eastAsia"/>
+          <w:b/>
+          <w:sz w:val="60"/>
+          <w:szCs w:val="60"/>
+        </w:rPr>
+        <w:t>随</w:t>
+      </w:r>
+      <w:r>
+        <w:rPr>
+          <w:rFonts w:ascii="Noto Serif" w:eastAsia="Noto Serif SC" w:hAnsi="Noto Serif" w:cs="Noto Serif" w:hint="eastAsia"/>
+          <w:b/>
+          <w:sz w:val="60"/>
+          <w:szCs w:val="60"/>
+        </w:rPr>
+        <w:t xml:space="preserve"> </w:t>
+      </w:r>
+      <w:r>
+        <w:rPr>
+          <w:rFonts w:ascii="Noto Serif" w:eastAsia="Noto Serif SC" w:hAnsi="Noto Serif" w:cs="Noto Serif" w:hint="eastAsia"/>
+          <w:b/>
+          <w:sz w:val="60"/>
+          <w:szCs w:val="60"/>
+        </w:rPr>
+        <w:t>想</w:t>
+      </w:r>
+    </w:p>
+    <w:p>
+      <w:pPr>
+        <w:jc w:val="right"/>
+        <w:rPr>
+          <w:rFonts w:ascii="Noto Serif" w:eastAsia="Noto Serif SC" w:hAnsi="Noto Serif" w:cs="Noto Serif"/>
           <w:b/>
           <w:sz w:val="56"/>
           <w:szCs w:val="96"/>
-        </w:rPr>
-        <w:t>山</w:t>
-      </w:r>
+          <w:lang w:val="en-US"/>
+        </w:rPr>
+      </w:pPr>
       <w:r>
         <w:rPr>
           <w:rFonts w:ascii="Noto Serif" w:eastAsia="Noto Serif SC" w:hAnsi="Noto Serif" w:cs="Noto Serif" w:hint="eastAsia"/>
@@ -64,72 +130,6 @@
           <w:sz w:val="56"/>
           <w:szCs w:val="96"/>
         </w:rPr>
-        <w:t xml:space="preserve"> </w:t>
-      </w:r>
-      <w:r>
-        <w:rPr>
-          <w:rFonts w:ascii="Noto Serif" w:eastAsia="Noto Serif SC" w:hAnsi="Noto Serif" w:cs="Noto Serif" w:hint="eastAsia"/>
-          <w:b/>
-          <w:sz w:val="56"/>
-          <w:szCs w:val="96"/>
-        </w:rPr>
-        <w:t>谣</w:t>
-      </w:r>
-      <w:r>
-        <w:rPr>
-          <w:rFonts w:ascii="Noto Serif" w:eastAsia="Noto Serif SC" w:hAnsi="Noto Serif" w:cs="Noto Serif" w:hint="eastAsia"/>
-          <w:b/>
-          <w:sz w:val="56"/>
-          <w:szCs w:val="96"/>
-        </w:rPr>
-        <w:t xml:space="preserve"> </w:t>
-      </w:r>
-      <w:r>
-        <w:rPr>
-          <w:rFonts w:ascii="Noto Serif" w:eastAsia="Noto Serif SC" w:hAnsi="Noto Serif" w:cs="Noto Serif" w:hint="eastAsia"/>
-          <w:b/>
-          <w:sz w:val="56"/>
-          <w:szCs w:val="96"/>
-        </w:rPr>
-        <w:t>随</w:t>
-      </w:r>
-      <w:r>
-        <w:rPr>
-          <w:rFonts w:ascii="Noto Serif" w:eastAsia="Noto Serif SC" w:hAnsi="Noto Serif" w:cs="Noto Serif" w:hint="eastAsia"/>
-          <w:b/>
-          <w:sz w:val="56"/>
-          <w:szCs w:val="96"/>
-        </w:rPr>
-        <w:t xml:space="preserve"> </w:t>
-      </w:r>
-      <w:r>
-        <w:rPr>
-          <w:rFonts w:ascii="Noto Serif" w:eastAsia="Noto Serif SC" w:hAnsi="Noto Serif" w:cs="Noto Serif" w:hint="eastAsia"/>
-          <w:b/>
-          <w:sz w:val="56"/>
-          <w:szCs w:val="96"/>
-        </w:rPr>
-        <w:t>想</w:t>
-      </w:r>
-    </w:p>
-    <w:p>
-      <w:pPr>
-        <w:jc w:val="right"/>
-        <w:rPr>
-          <w:rFonts w:ascii="Noto Serif" w:eastAsia="Noto Serif SC" w:hAnsi="Noto Serif" w:cs="Noto Serif"/>
-          <w:b/>
-          <w:sz w:val="56"/>
-          <w:szCs w:val="96"/>
-          <w:lang w:val="en-US"/>
-        </w:rPr>
-      </w:pPr>
-      <w:r>
-        <w:rPr>
-          <w:rFonts w:ascii="Noto Serif" w:eastAsia="Noto Serif SC" w:hAnsi="Noto Serif" w:cs="Noto Serif" w:hint="eastAsia"/>
-          <w:b/>
-          <w:sz w:val="56"/>
-          <w:szCs w:val="96"/>
-        </w:rPr>
         <w:t>The Capriccio of the Mountain Folk Song</w:t>
       </w:r>
     </w:p>
@@ -149,15 +149,15 @@
         <w:jc w:val="right"/>
         <w:rPr>
           <w:rFonts w:ascii="Noto Serif" w:eastAsia="Noto Serif SC" w:hAnsi="Noto Serif" w:cs="Noto Serif"/>
-          <w:sz w:val="32"/>
-          <w:szCs w:val="56"/>
-        </w:rPr>
-      </w:pPr>
-      <w:r>
-        <w:rPr>
-          <w:rFonts w:ascii="Noto Serif" w:eastAsia="Noto Serif SC" w:hAnsi="Noto Serif" w:cs="Noto Serif" w:hint="eastAsia"/>
-          <w:sz w:val="32"/>
-          <w:szCs w:val="56"/>
+          <w:sz w:val="36"/>
+          <w:szCs w:val="72"/>
+        </w:rPr>
+      </w:pPr>
+      <w:r>
+        <w:rPr>
+          <w:rFonts w:ascii="Noto Serif" w:eastAsia="Noto Serif SC" w:hAnsi="Noto Serif" w:cs="Noto Serif" w:hint="eastAsia"/>
+          <w:sz w:val="36"/>
+          <w:szCs w:val="72"/>
         </w:rPr>
         <w:t>竹笛协奏曲</w:t>
       </w:r>
@@ -229,15 +229,15 @@
         <w:jc w:val="right"/>
         <w:rPr>
           <w:rFonts w:ascii="Noto Serif" w:eastAsia="Noto Serif SC" w:hAnsi="Noto Serif" w:cs="Noto Serif"/>
-          <w:sz w:val="40"/>
-          <w:szCs w:val="96"/>
-        </w:rPr>
-      </w:pPr>
-      <w:r>
-        <w:rPr>
-          <w:rFonts w:ascii="Noto Serif" w:eastAsia="Noto Serif SC" w:hAnsi="Noto Serif" w:cs="Noto Serif" w:hint="eastAsia"/>
-          <w:sz w:val="40"/>
-          <w:szCs w:val="96"/>
+          <w:sz w:val="44"/>
+          <w:szCs w:val="144"/>
+        </w:rPr>
+      </w:pPr>
+      <w:r>
+        <w:rPr>
+          <w:rFonts w:ascii="Noto Serif" w:eastAsia="Noto Serif SC" w:hAnsi="Noto Serif" w:cs="Noto Serif" w:hint="eastAsia"/>
+          <w:sz w:val="44"/>
+          <w:szCs w:val="144"/>
         </w:rPr>
         <w:t>王东旭</w:t>
       </w:r>
@@ -772,20 +772,86 @@
         <w:rPr>
           <w:rFonts w:ascii="Noto Serif" w:eastAsia="Noto Serif SC" w:hAnsi="Noto Serif" w:cs="Noto Serif"/>
           <w:b/>
-          <w:sz w:val="56"/>
-          <w:szCs w:val="96"/>
-          <w:lang w:val="en-US"/>
-        </w:rPr>
-      </w:pPr>
-      <w:r>
-        <w:rPr>
-          <w:rFonts w:ascii="Noto Serif" w:eastAsia="Noto Serif SC" w:hAnsi="Noto Serif" w:cs="Noto Serif" w:hint="eastAsia"/>
+          <w:sz w:val="60"/>
+          <w:szCs w:val="60"/>
+          <w:lang w:val="en-US"/>
+        </w:rPr>
+      </w:pPr>
+      <w:r>
+        <w:rPr>
+          <w:rFonts w:ascii="Noto Serif" w:eastAsia="Noto Serif SC" w:hAnsi="Noto Serif" w:cs="Noto Serif" w:hint="eastAsia"/>
+          <w:b/>
+          <w:sz w:val="60"/>
+          <w:szCs w:val="60"/>
+        </w:rPr>
+        <w:t>山</w:t>
+      </w:r>
+      <w:r>
+        <w:rPr>
+          <w:rFonts w:ascii="Noto Serif" w:eastAsia="Noto Serif SC" w:hAnsi="Noto Serif" w:cs="Noto Serif" w:hint="eastAsia"/>
+          <w:b/>
+          <w:sz w:val="60"/>
+          <w:szCs w:val="60"/>
+        </w:rPr>
+        <w:t xml:space="preserve"> </w:t>
+      </w:r>
+      <w:r>
+        <w:rPr>
+          <w:rFonts w:ascii="Noto Serif" w:eastAsia="Noto Serif SC" w:hAnsi="Noto Serif" w:cs="Noto Serif" w:hint="eastAsia"/>
+          <w:b/>
+          <w:sz w:val="60"/>
+          <w:szCs w:val="60"/>
+        </w:rPr>
+        <w:t>谣</w:t>
+      </w:r>
+      <w:r>
+        <w:rPr>
+          <w:rFonts w:ascii="Noto Serif" w:eastAsia="Noto Serif SC" w:hAnsi="Noto Serif" w:cs="Noto Serif" w:hint="eastAsia"/>
+          <w:b/>
+          <w:sz w:val="60"/>
+          <w:szCs w:val="60"/>
+        </w:rPr>
+        <w:t xml:space="preserve"> </w:t>
+      </w:r>
+      <w:r>
+        <w:rPr>
+          <w:rFonts w:ascii="Noto Serif" w:eastAsia="Noto Serif SC" w:hAnsi="Noto Serif" w:cs="Noto Serif" w:hint="eastAsia"/>
+          <w:b/>
+          <w:sz w:val="60"/>
+          <w:szCs w:val="60"/>
+        </w:rPr>
+        <w:t>随</w:t>
+      </w:r>
+      <w:r>
+        <w:rPr>
+          <w:rFonts w:ascii="Noto Serif" w:eastAsia="Noto Serif SC" w:hAnsi="Noto Serif" w:cs="Noto Serif" w:hint="eastAsia"/>
+          <w:b/>
+          <w:sz w:val="60"/>
+          <w:szCs w:val="60"/>
+        </w:rPr>
+        <w:t xml:space="preserve"> </w:t>
+      </w:r>
+      <w:r>
+        <w:rPr>
+          <w:rFonts w:ascii="Noto Serif" w:eastAsia="Noto Serif SC" w:hAnsi="Noto Serif" w:cs="Noto Serif" w:hint="eastAsia"/>
+          <w:b/>
+          <w:sz w:val="60"/>
+          <w:szCs w:val="60"/>
+        </w:rPr>
+        <w:t>想</w:t>
+      </w:r>
+    </w:p>
+    <w:p>
+      <w:pPr>
+        <w:jc w:val="right"/>
+        <w:rPr>
+          <w:rFonts w:ascii="Noto Serif" w:eastAsia="Noto Serif SC" w:hAnsi="Noto Serif" w:cs="Noto Serif"/>
           <w:b/>
           <w:sz w:val="56"/>
           <w:szCs w:val="96"/>
-        </w:rPr>
-        <w:t>山</w:t>
-      </w:r>
+          <w:lang w:val="en-US"/>
+        </w:rPr>
+      </w:pPr>
       <w:r>
         <w:rPr>
           <w:rFonts w:ascii="Noto Serif" w:eastAsia="Noto Serif SC" w:hAnsi="Noto Serif" w:cs="Noto Serif" w:hint="eastAsia"/>
@@ -793,72 +859,6 @@
           <w:sz w:val="56"/>
           <w:szCs w:val="96"/>
         </w:rPr>
-        <w:t xml:space="preserve"> </w:t>
-      </w:r>
-      <w:r>
-        <w:rPr>
-          <w:rFonts w:ascii="Noto Serif" w:eastAsia="Noto Serif SC" w:hAnsi="Noto Serif" w:cs="Noto Serif" w:hint="eastAsia"/>
-          <w:b/>
-          <w:sz w:val="56"/>
-          <w:szCs w:val="96"/>
-        </w:rPr>
-        <w:t>谣</w:t>
-      </w:r>
-      <w:r>
-        <w:rPr>
-          <w:rFonts w:ascii="Noto Serif" w:eastAsia="Noto Serif SC" w:hAnsi="Noto Serif" w:cs="Noto Serif" w:hint="eastAsia"/>
-          <w:b/>
-          <w:sz w:val="56"/>
-          <w:szCs w:val="96"/>
-        </w:rPr>
-        <w:t xml:space="preserve"> </w:t>
-      </w:r>
-      <w:r>
-        <w:rPr>
-          <w:rFonts w:ascii="Noto Serif" w:eastAsia="Noto Serif SC" w:hAnsi="Noto Serif" w:cs="Noto Serif" w:hint="eastAsia"/>
-          <w:b/>
-          <w:sz w:val="56"/>
-          <w:szCs w:val="96"/>
-        </w:rPr>
-        <w:t>随</w:t>
-      </w:r>
-      <w:r>
-        <w:rPr>
-          <w:rFonts w:ascii="Noto Serif" w:eastAsia="Noto Serif SC" w:hAnsi="Noto Serif" w:cs="Noto Serif" w:hint="eastAsia"/>
-          <w:b/>
-          <w:sz w:val="56"/>
-          <w:szCs w:val="96"/>
-        </w:rPr>
-        <w:t xml:space="preserve"> </w:t>
-      </w:r>
-      <w:r>
-        <w:rPr>
-          <w:rFonts w:ascii="Noto Serif" w:eastAsia="Noto Serif SC" w:hAnsi="Noto Serif" w:cs="Noto Serif" w:hint="eastAsia"/>
-          <w:b/>
-          <w:sz w:val="56"/>
-          <w:szCs w:val="96"/>
-        </w:rPr>
-        <w:t>想</w:t>
-      </w:r>
-    </w:p>
-    <w:p>
-      <w:pPr>
-        <w:jc w:val="right"/>
-        <w:rPr>
-          <w:rFonts w:ascii="Noto Serif" w:eastAsia="Noto Serif SC" w:hAnsi="Noto Serif" w:cs="Noto Serif"/>
-          <w:b/>
-          <w:sz w:val="56"/>
-          <w:szCs w:val="96"/>
-          <w:lang w:val="en-US"/>
-        </w:rPr>
-      </w:pPr>
-      <w:r>
-        <w:rPr>
-          <w:rFonts w:ascii="Noto Serif" w:eastAsia="Noto Serif SC" w:hAnsi="Noto Serif" w:cs="Noto Serif" w:hint="eastAsia"/>
-          <w:b/>
-          <w:sz w:val="56"/>
-          <w:szCs w:val="96"/>
-        </w:rPr>
         <w:t>The Capriccio of the Mountain Folk Song</w:t>
       </w:r>
     </w:p>
@@ -878,15 +878,15 @@
         <w:jc w:val="right"/>
         <w:rPr>
           <w:rFonts w:ascii="Noto Serif" w:eastAsia="Noto Serif SC" w:hAnsi="Noto Serif" w:cs="Noto Serif"/>
-          <w:sz w:val="32"/>
-          <w:szCs w:val="56"/>
-        </w:rPr>
-      </w:pPr>
-      <w:r>
-        <w:rPr>
-          <w:rFonts w:ascii="Noto Serif" w:eastAsia="Noto Serif SC" w:hAnsi="Noto Serif" w:cs="Noto Serif" w:hint="eastAsia"/>
-          <w:sz w:val="32"/>
-          <w:szCs w:val="56"/>
+          <w:sz w:val="36"/>
+          <w:szCs w:val="72"/>
+        </w:rPr>
+      </w:pPr>
+      <w:r>
+        <w:rPr>
+          <w:rFonts w:ascii="Noto Serif" w:eastAsia="Noto Serif SC" w:hAnsi="Noto Serif" w:cs="Noto Serif" w:hint="eastAsia"/>
+          <w:sz w:val="36"/>
+          <w:szCs w:val="72"/>
         </w:rPr>
         <w:t>竹笛协奏曲</w:t>
       </w:r>
@@ -961,15 +961,15 @@
         <w:jc w:val="right"/>
         <w:rPr>
           <w:rFonts w:ascii="Noto Serif" w:eastAsia="Noto Serif SC" w:hAnsi="Noto Serif" w:cs="Noto Serif"/>
-          <w:sz w:val="40"/>
-          <w:szCs w:val="96"/>
-        </w:rPr>
-      </w:pPr>
-      <w:r>
-        <w:rPr>
-          <w:rFonts w:ascii="Noto Serif" w:eastAsia="Noto Serif SC" w:hAnsi="Noto Serif" w:cs="Noto Serif" w:hint="eastAsia"/>
-          <w:sz w:val="40"/>
-          <w:szCs w:val="96"/>
+          <w:sz w:val="44"/>
+          <w:szCs w:val="144"/>
+        </w:rPr>
+      </w:pPr>
+      <w:r>
+        <w:rPr>
+          <w:rFonts w:ascii="Noto Serif" w:eastAsia="Noto Serif SC" w:hAnsi="Noto Serif" w:cs="Noto Serif" w:hint="eastAsia"/>
+          <w:sz w:val="44"/>
+          <w:szCs w:val="144"/>
         </w:rPr>
         <w:t>王东旭</w:t>
       </w:r>
@@ -1141,22 +1141,86 @@
           <w:rFonts w:ascii="Noto Serif" w:eastAsia="Noto Serif SC" w:hAnsi="Noto Serif" w:cs="Noto Serif"/>
           <w:b/>
           <w:color w:val="000000" w:themeColor="text1"/>
-          <w:sz w:val="20"/>
-          <w:szCs w:val="24"/>
-          <w:lang w:val="en-US"/>
-        </w:rPr>
-      </w:pPr>
-      <w:r>
-        <w:rPr>
-          <w:rFonts w:ascii="Noto Serif" w:eastAsia="Noto Serif SC" w:hAnsi="Noto Serif" w:cs="Noto Serif" w:hint="eastAsia"/>
+          <w:szCs w:val="32"/>
+          <w:lang w:val="en-US"/>
+        </w:rPr>
+      </w:pPr>
+      <w:r>
+        <w:rPr>
+          <w:rFonts w:ascii="Noto Serif" w:eastAsia="Noto Serif SC" w:hAnsi="Noto Serif" w:cs="Noto Serif" w:hint="eastAsia"/>
+          <w:b/>
+          <w:color w:val="000000" w:themeColor="text1"/>
+          <w:szCs w:val="32"/>
+        </w:rPr>
+        <w:lastRenderedPageBreak/>
+        <w:t>山</w:t>
+      </w:r>
+      <w:r>
+        <w:rPr>
+          <w:rFonts w:ascii="Noto Serif" w:eastAsia="Noto Serif SC" w:hAnsi="Noto Serif" w:cs="Noto Serif" w:hint="eastAsia"/>
+          <w:b/>
+          <w:color w:val="000000" w:themeColor="text1"/>
+          <w:szCs w:val="32"/>
+        </w:rPr>
+        <w:t xml:space="preserve"> </w:t>
+      </w:r>
+      <w:r>
+        <w:rPr>
+          <w:rFonts w:ascii="Noto Serif" w:eastAsia="Noto Serif SC" w:hAnsi="Noto Serif" w:cs="Noto Serif" w:hint="eastAsia"/>
+          <w:b/>
+          <w:color w:val="000000" w:themeColor="text1"/>
+          <w:szCs w:val="32"/>
+        </w:rPr>
+        <w:t>谣</w:t>
+      </w:r>
+      <w:r>
+        <w:rPr>
+          <w:rFonts w:ascii="Noto Serif" w:eastAsia="Noto Serif SC" w:hAnsi="Noto Serif" w:cs="Noto Serif" w:hint="eastAsia"/>
+          <w:b/>
+          <w:color w:val="000000" w:themeColor="text1"/>
+          <w:szCs w:val="32"/>
+        </w:rPr>
+        <w:t xml:space="preserve"> </w:t>
+      </w:r>
+      <w:r>
+        <w:rPr>
+          <w:rFonts w:ascii="Noto Serif" w:eastAsia="Noto Serif SC" w:hAnsi="Noto Serif" w:cs="Noto Serif" w:hint="eastAsia"/>
+          <w:b/>
+          <w:color w:val="000000" w:themeColor="text1"/>
+          <w:szCs w:val="32"/>
+        </w:rPr>
+        <w:t>随</w:t>
+      </w:r>
+      <w:r>
+        <w:rPr>
+          <w:rFonts w:ascii="Noto Serif" w:eastAsia="Noto Serif SC" w:hAnsi="Noto Serif" w:cs="Noto Serif" w:hint="eastAsia"/>
+          <w:b/>
+          <w:color w:val="000000" w:themeColor="text1"/>
+          <w:szCs w:val="32"/>
+        </w:rPr>
+        <w:t xml:space="preserve"> </w:t>
+      </w:r>
+      <w:r>
+        <w:rPr>
+          <w:rFonts w:ascii="Noto Serif" w:eastAsia="Noto Serif SC" w:hAnsi="Noto Serif" w:cs="Noto Serif" w:hint="eastAsia"/>
+          <w:b/>
+          <w:color w:val="000000" w:themeColor="text1"/>
+          <w:szCs w:val="32"/>
+        </w:rPr>
+        <w:t>想</w:t>
+      </w:r>
+    </w:p>
+    <w:p>
+      <w:pPr>
+        <w:rPr>
+          <w:rFonts w:ascii="Noto Serif" w:eastAsia="Noto Serif SC" w:hAnsi="Noto Serif" w:cs="Noto Serif"/>
           <w:b/>
           <w:color w:val="000000" w:themeColor="text1"/>
           <w:sz w:val="20"/>
           <w:szCs w:val="24"/>
-        </w:rPr>
-        <w:lastRenderedPageBreak/>
-        <w:t>山</w:t>
-      </w:r>
+          <w:lang w:val="en-US"/>
+        </w:rPr>
+      </w:pPr>
       <w:r>
         <w:rPr>
           <w:rFonts w:ascii="Noto Serif" w:eastAsia="Noto Serif SC" w:hAnsi="Noto Serif" w:cs="Noto Serif" w:hint="eastAsia"/>
@@ -1165,90 +1229,135 @@
           <w:sz w:val="20"/>
           <w:szCs w:val="24"/>
         </w:rPr>
-        <w:t xml:space="preserve"> </w:t>
-      </w:r>
-      <w:r>
-        <w:rPr>
-          <w:rFonts w:ascii="Noto Serif" w:eastAsia="Noto Serif SC" w:hAnsi="Noto Serif" w:cs="Noto Serif" w:hint="eastAsia"/>
-          <w:b/>
+        <w:t>The Capriccio of the Mountain Folk Song</w:t>
+      </w:r>
+    </w:p>
+    <w:p>
+      <w:pPr>
+        <w:rPr>
+          <w:rFonts w:ascii="Noto Serif" w:eastAsia="Noto Serif SC" w:hAnsi="Noto Serif" w:cs="Noto Serif"/>
           <w:color w:val="000000" w:themeColor="text1"/>
           <w:sz w:val="20"/>
           <w:szCs w:val="24"/>
         </w:rPr>
-        <w:t>谣</w:t>
-      </w:r>
-      <w:r>
-        <w:rPr>
-          <w:rFonts w:ascii="Noto Serif" w:eastAsia="Noto Serif SC" w:hAnsi="Noto Serif" w:cs="Noto Serif" w:hint="eastAsia"/>
-          <w:b/>
+      </w:pPr>
+    </w:p>
+    <w:p>
+      <w:pPr>
+        <w:rPr>
+          <w:rFonts w:ascii="Noto Serif" w:eastAsia="Noto Serif SC" w:hAnsi="Noto Serif" w:cs="Noto Serif"/>
           <w:color w:val="000000" w:themeColor="text1"/>
           <w:sz w:val="20"/>
           <w:szCs w:val="24"/>
         </w:rPr>
-        <w:t xml:space="preserve"> </w:t>
-      </w:r>
-      <w:r>
-        <w:rPr>
-          <w:rFonts w:ascii="Noto Serif" w:eastAsia="Noto Serif SC" w:hAnsi="Noto Serif" w:cs="Noto Serif" w:hint="eastAsia"/>
-          <w:b/>
+      </w:pPr>
+      <w:r>
+        <w:rPr>
+          <w:rFonts w:ascii="Noto Serif" w:eastAsia="Noto Serif SC" w:hAnsi="Noto Serif" w:cs="Noto Serif"/>
           <w:color w:val="000000" w:themeColor="text1"/>
           <w:sz w:val="20"/>
           <w:szCs w:val="24"/>
         </w:rPr>
-        <w:t>随</w:t>
-      </w:r>
-      <w:r>
-        <w:rPr>
-          <w:rFonts w:ascii="Noto Serif" w:eastAsia="Noto Serif SC" w:hAnsi="Noto Serif" w:cs="Noto Serif" w:hint="eastAsia"/>
-          <w:b/>
+        <w:t xml:space="preserve">Copyright © Singapore Chinese Orchestra Ltd. All rights reserved. </w:t>
+      </w:r>
+    </w:p>
+    <w:p>
+      <w:pPr>
+        <w:rPr>
+          <w:rFonts w:ascii="Noto Serif" w:eastAsia="Noto Serif SC" w:hAnsi="Noto Serif" w:cs="Noto Serif"/>
           <w:color w:val="000000" w:themeColor="text1"/>
           <w:sz w:val="20"/>
           <w:szCs w:val="24"/>
         </w:rPr>
-        <w:t xml:space="preserve"> </w:t>
-      </w:r>
-      <w:r>
-        <w:rPr>
-          <w:rFonts w:ascii="Noto Serif" w:eastAsia="Noto Serif SC" w:hAnsi="Noto Serif" w:cs="Noto Serif" w:hint="eastAsia"/>
-          <w:b/>
+      </w:pPr>
+    </w:p>
+    <w:p>
+      <w:pPr>
+        <w:rPr>
+          <w:rFonts w:ascii="Noto Serif" w:eastAsia="Noto Serif SC" w:hAnsi="Noto Serif" w:cs="Noto Serif"/>
+          <w:color w:val="000000" w:themeColor="text1"/>
+          <w:szCs w:val="32"/>
+          <w:lang w:val="en-US"/>
+        </w:rPr>
+      </w:pPr>
+      <w:r>
+        <w:rPr>
+          <w:rFonts w:ascii="Noto Serif" w:eastAsia="Noto Serif SC" w:hAnsi="Noto Serif" w:cs="Noto Serif"/>
+          <w:color w:val="000000" w:themeColor="text1"/>
+          <w:szCs w:val="32"/>
+        </w:rPr>
+        <w:t>版权所有</w:t>
+      </w:r>
+      <w:r>
+        <w:rPr>
+          <w:rFonts w:ascii="Noto Serif" w:eastAsia="Noto Serif SC" w:hAnsi="Noto Serif" w:cs="Noto Serif"/>
+          <w:color w:val="000000" w:themeColor="text1"/>
+          <w:szCs w:val="32"/>
+        </w:rPr>
+        <w:t xml:space="preserve">, </w:t>
+      </w:r>
+      <w:r>
+        <w:rPr>
+          <w:rFonts w:ascii="Noto Serif" w:eastAsia="Noto Serif SC" w:hAnsi="Noto Serif" w:cs="Noto Serif"/>
+          <w:color w:val="000000" w:themeColor="text1"/>
+          <w:szCs w:val="32"/>
+        </w:rPr>
+        <w:t>未经许可</w:t>
+      </w:r>
+      <w:r>
+        <w:rPr>
+          <w:rFonts w:ascii="Noto Serif" w:eastAsia="Noto Serif SC" w:hAnsi="Noto Serif" w:cs="Noto Serif"/>
+          <w:color w:val="000000" w:themeColor="text1"/>
+          <w:szCs w:val="32"/>
+        </w:rPr>
+        <w:t xml:space="preserve">, </w:t>
+      </w:r>
+      <w:r>
+        <w:rPr>
+          <w:rFonts w:ascii="Noto Serif" w:eastAsia="Noto Serif SC" w:hAnsi="Noto Serif" w:cs="Noto Serif"/>
+          <w:color w:val="000000" w:themeColor="text1"/>
+          <w:szCs w:val="32"/>
+        </w:rPr>
+        <w:t>不得以任何形式印刷、复制、扫描或发行。</w:t>
+      </w:r>
+    </w:p>
+    <w:p>
+      <w:pPr>
+        <w:rPr>
+          <w:rFonts w:ascii="Noto Serif" w:eastAsia="Noto Serif SC" w:hAnsi="Noto Serif" w:cs="Noto Serif"/>
           <w:color w:val="000000" w:themeColor="text1"/>
           <w:sz w:val="20"/>
           <w:szCs w:val="24"/>
         </w:rPr>
-        <w:t>想</w:t>
-      </w:r>
-    </w:p>
-    <w:p>
-      <w:pPr>
-        <w:rPr>
-          <w:rFonts w:ascii="Noto Serif" w:eastAsia="Noto Serif SC" w:hAnsi="Noto Serif" w:cs="Noto Serif"/>
-          <w:b/>
+      </w:pPr>
+      <w:r>
+        <w:rPr>
+          <w:rFonts w:ascii="Noto Serif" w:eastAsia="Noto Serif SC" w:hAnsi="Noto Serif" w:cs="Noto Serif"/>
           <w:color w:val="000000" w:themeColor="text1"/>
           <w:sz w:val="20"/>
           <w:szCs w:val="24"/>
-          <w:lang w:val="en-US"/>
-        </w:rPr>
-      </w:pPr>
-      <w:r>
-        <w:rPr>
-          <w:rFonts w:ascii="Noto Serif" w:eastAsia="Noto Serif SC" w:hAnsi="Noto Serif" w:cs="Noto Serif" w:hint="eastAsia"/>
-          <w:b/>
+        </w:rPr>
+        <w:t xml:space="preserve">Unauthorised printing, reproduction, scanning or distribution is strictly prohibited </w:t>
+      </w:r>
+    </w:p>
+    <w:p>
+      <w:pPr>
+        <w:rPr>
+          <w:rFonts w:ascii="Noto Serif" w:eastAsia="Noto Serif SC" w:hAnsi="Noto Serif" w:cs="Noto Serif"/>
           <w:color w:val="000000" w:themeColor="text1"/>
           <w:sz w:val="20"/>
           <w:szCs w:val="24"/>
         </w:rPr>
-        <w:t>The Capriccio of the Mountain Folk Song</w:t>
-      </w:r>
-    </w:p>
-    <w:p>
-      <w:pPr>
+      </w:pPr>
+      <w:r>
         <w:rPr>
           <w:rFonts w:ascii="Noto Serif" w:eastAsia="Noto Serif SC" w:hAnsi="Noto Serif" w:cs="Noto Serif"/>
           <w:color w:val="000000" w:themeColor="text1"/>
           <w:sz w:val="20"/>
           <w:szCs w:val="24"/>
         </w:rPr>
-      </w:pPr>
+        <w:t>without the express permission of the copyright holder.</w:t>
+      </w:r>
     </w:p>
     <w:p>
       <w:pPr>
@@ -1259,25 +1368,25 @@
           <w:szCs w:val="24"/>
         </w:rPr>
       </w:pPr>
-      <w:r>
+    </w:p>
+    <w:p>
+      <w:pPr>
         <w:rPr>
           <w:rFonts w:ascii="Noto Serif" w:eastAsia="Noto Serif SC" w:hAnsi="Noto Serif" w:cs="Noto Serif"/>
           <w:color w:val="000000" w:themeColor="text1"/>
           <w:sz w:val="20"/>
           <w:szCs w:val="24"/>
         </w:rPr>
-        <w:t xml:space="preserve">Copyright © Singapore Chinese Orchestra Ltd. All rights reserved. </w:t>
-      </w:r>
-    </w:p>
-    <w:p>
-      <w:pPr>
+      </w:pPr>
+      <w:r>
         <w:rPr>
           <w:rFonts w:ascii="Noto Serif" w:eastAsia="Noto Serif SC" w:hAnsi="Noto Serif" w:cs="Noto Serif"/>
           <w:color w:val="000000" w:themeColor="text1"/>
           <w:sz w:val="20"/>
           <w:szCs w:val="24"/>
         </w:rPr>
-      </w:pPr>
+        <w:t>Printed in Singapore.</w:t>
+      </w:r>
     </w:p>
     <w:p>
       <w:pPr>
@@ -1286,18 +1395,18 @@
           <w:color w:val="000000" w:themeColor="text1"/>
           <w:sz w:val="20"/>
           <w:szCs w:val="24"/>
-          <w:lang w:val="en-US"/>
-        </w:rPr>
-      </w:pPr>
-      <w:r>
+        </w:rPr>
+      </w:pPr>
+    </w:p>
+    <w:p>
+      <w:pPr>
         <w:rPr>
           <w:rFonts w:ascii="Noto Serif" w:eastAsia="Noto Serif SC" w:hAnsi="Noto Serif" w:cs="Noto Serif"/>
           <w:color w:val="000000" w:themeColor="text1"/>
           <w:sz w:val="20"/>
           <w:szCs w:val="24"/>
         </w:rPr>
-        <w:t>版权所有</w:t>
-      </w:r>
+      </w:pPr>
       <w:r>
         <w:rPr>
           <w:rFonts w:ascii="Noto Serif" w:eastAsia="Noto Serif SC" w:hAnsi="Noto Serif" w:cs="Noto Serif"/>
@@ -1305,17 +1414,18 @@
           <w:sz w:val="20"/>
           <w:szCs w:val="24"/>
         </w:rPr>
-        <w:t xml:space="preserve">, </w:t>
-      </w:r>
-      <w:r>
+        <w:t>Singapore Chinese Orchestra Ltd.</w:t>
+      </w:r>
+    </w:p>
+    <w:p>
+      <w:pPr>
         <w:rPr>
           <w:rFonts w:ascii="Noto Serif" w:eastAsia="Noto Serif SC" w:hAnsi="Noto Serif" w:cs="Noto Serif"/>
           <w:color w:val="000000" w:themeColor="text1"/>
           <w:sz w:val="20"/>
           <w:szCs w:val="24"/>
         </w:rPr>
-        <w:t>未经许可</w:t>
-      </w:r>
+      </w:pPr>
       <w:r>
         <w:rPr>
           <w:rFonts w:ascii="Noto Serif" w:eastAsia="Noto Serif SC" w:hAnsi="Noto Serif" w:cs="Noto Serif"/>
@@ -1323,178 +1433,46 @@
           <w:sz w:val="20"/>
           <w:szCs w:val="24"/>
         </w:rPr>
-        <w:t xml:space="preserve">, </w:t>
-      </w:r>
-      <w:r>
+        <w:t xml:space="preserve">Singapore Conference Hall, </w:t>
+      </w:r>
+    </w:p>
+    <w:p>
+      <w:pPr>
         <w:rPr>
           <w:rFonts w:ascii="Noto Serif" w:eastAsia="Noto Serif SC" w:hAnsi="Noto Serif" w:cs="Noto Serif"/>
           <w:color w:val="000000" w:themeColor="text1"/>
           <w:sz w:val="20"/>
           <w:szCs w:val="24"/>
         </w:rPr>
-        <w:t>不得以任何形式印刷、复制、扫描或发行。</w:t>
-      </w:r>
-    </w:p>
-    <w:p>
-      <w:pPr>
+      </w:pPr>
+      <w:r>
         <w:rPr>
           <w:rFonts w:ascii="Noto Serif" w:eastAsia="Noto Serif SC" w:hAnsi="Noto Serif" w:cs="Noto Serif"/>
           <w:color w:val="000000" w:themeColor="text1"/>
           <w:sz w:val="20"/>
           <w:szCs w:val="24"/>
         </w:rPr>
-      </w:pPr>
-      <w:r>
+        <w:t xml:space="preserve">7 Shenton Way, </w:t>
+      </w:r>
+    </w:p>
+    <w:p>
+      <w:pPr>
         <w:rPr>
           <w:rFonts w:ascii="Noto Serif" w:eastAsia="Noto Serif SC" w:hAnsi="Noto Serif" w:cs="Noto Serif"/>
           <w:color w:val="000000" w:themeColor="text1"/>
           <w:sz w:val="20"/>
           <w:szCs w:val="24"/>
         </w:rPr>
-        <w:t xml:space="preserve">Unauthorised printing, reproduction, scanning or distribution is strictly prohibited </w:t>
-      </w:r>
-    </w:p>
-    <w:p>
-      <w:pPr>
+      </w:pPr>
+      <w:r>
         <w:rPr>
           <w:rFonts w:ascii="Noto Serif" w:eastAsia="Noto Serif SC" w:hAnsi="Noto Serif" w:cs="Noto Serif"/>
           <w:color w:val="000000" w:themeColor="text1"/>
           <w:sz w:val="20"/>
           <w:szCs w:val="24"/>
         </w:rPr>
-      </w:pPr>
-      <w:r>
-        <w:rPr>
-          <w:rFonts w:ascii="Noto Serif" w:eastAsia="Noto Serif SC" w:hAnsi="Noto Serif" w:cs="Noto Serif"/>
-          <w:color w:val="000000" w:themeColor="text1"/>
-          <w:sz w:val="20"/>
-          <w:szCs w:val="24"/>
-        </w:rPr>
-        <w:t>without the express permission of the copyright holder.</w:t>
-      </w:r>
-    </w:p>
-    <w:p>
-      <w:pPr>
-        <w:rPr>
-          <w:rFonts w:ascii="Noto Serif" w:eastAsia="Noto Serif SC" w:hAnsi="Noto Serif" w:cs="Noto Serif"/>
-          <w:color w:val="000000" w:themeColor="text1"/>
-          <w:sz w:val="20"/>
-          <w:szCs w:val="24"/>
-        </w:rPr>
-      </w:pPr>
-    </w:p>
-    <w:p>
-      <w:pPr>
-        <w:rPr>
-          <w:rFonts w:ascii="Noto Serif" w:eastAsia="Noto Serif SC" w:hAnsi="Noto Serif" w:cs="Noto Serif"/>
-          <w:color w:val="000000" w:themeColor="text1"/>
-          <w:sz w:val="20"/>
-          <w:szCs w:val="24"/>
-        </w:rPr>
-      </w:pPr>
-      <w:r>
-        <w:rPr>
-          <w:rFonts w:ascii="Noto Serif" w:eastAsia="Noto Serif SC" w:hAnsi="Noto Serif" w:cs="Noto Serif"/>
-          <w:color w:val="000000" w:themeColor="text1"/>
-          <w:sz w:val="20"/>
-          <w:szCs w:val="24"/>
-        </w:rPr>
-        <w:t>Printed in Singapore.</w:t>
-      </w:r>
-    </w:p>
-    <w:p>
-      <w:pPr>
-        <w:rPr>
-          <w:rFonts w:ascii="Noto Serif" w:eastAsia="Noto Serif SC" w:hAnsi="Noto Serif" w:cs="Noto Serif"/>
-          <w:color w:val="000000" w:themeColor="text1"/>
-          <w:sz w:val="20"/>
-          <w:szCs w:val="24"/>
-        </w:rPr>
-      </w:pPr>
-    </w:p>
-    <w:p>
-      <w:pPr>
-        <w:rPr>
-          <w:rFonts w:ascii="Noto Serif" w:eastAsia="Noto Serif SC" w:hAnsi="Noto Serif" w:cs="Noto Serif"/>
-          <w:color w:val="000000" w:themeColor="text1"/>
-          <w:sz w:val="20"/>
-          <w:szCs w:val="24"/>
-        </w:rPr>
-      </w:pPr>
-      <w:r>
-        <w:rPr>
-          <w:rFonts w:ascii="Noto Serif" w:eastAsia="Noto Serif SC" w:hAnsi="Noto Serif" w:cs="Noto Serif"/>
-          <w:color w:val="000000" w:themeColor="text1"/>
-          <w:sz w:val="20"/>
-          <w:szCs w:val="24"/>
-        </w:rPr>
-        <w:t>Singapore Chinese Orchestra Ltd.</w:t>
-      </w:r>
-    </w:p>
-    <w:p>
-      <w:pPr>
-        <w:rPr>
-          <w:rFonts w:ascii="Noto Serif" w:eastAsia="Noto Serif SC" w:hAnsi="Noto Serif" w:cs="Noto Serif"/>
-          <w:color w:val="000000" w:themeColor="text1"/>
-          <w:sz w:val="20"/>
-          <w:szCs w:val="24"/>
-        </w:rPr>
-      </w:pPr>
-      <w:r>
-        <w:rPr>
-          <w:rFonts w:ascii="Noto Serif" w:eastAsia="Noto Serif SC" w:hAnsi="Noto Serif" w:cs="Noto Serif"/>
-          <w:color w:val="000000" w:themeColor="text1"/>
-          <w:sz w:val="20"/>
-          <w:szCs w:val="24"/>
-        </w:rPr>
-        <w:t xml:space="preserve">Singapore Conference Hall, </w:t>
-      </w:r>
-    </w:p>
-    <w:p>
-      <w:pPr>
-        <w:rPr>
-          <w:rFonts w:ascii="Noto Serif" w:eastAsia="Noto Serif SC" w:hAnsi="Noto Serif" w:cs="Noto Serif"/>
-          <w:color w:val="000000" w:themeColor="text1"/>
-          <w:sz w:val="20"/>
-          <w:szCs w:val="24"/>
-        </w:rPr>
-      </w:pPr>
-      <w:r>
-        <w:rPr>
-          <w:rFonts w:ascii="Noto Serif" w:eastAsia="Noto Serif SC" w:hAnsi="Noto Serif" w:cs="Noto Serif"/>
-          <w:color w:val="000000" w:themeColor="text1"/>
-          <w:sz w:val="20"/>
-          <w:szCs w:val="24"/>
-        </w:rPr>
-        <w:t xml:space="preserve">7 Shenton Way, </w:t>
-      </w:r>
-    </w:p>
-    <w:p>
-      <w:pPr>
-        <w:rPr>
-          <w:rFonts w:ascii="Noto Serif" w:eastAsia="Noto Serif SC" w:hAnsi="Noto Serif" w:cs="Noto Serif"/>
-          <w:color w:val="000000" w:themeColor="text1"/>
-          <w:sz w:val="20"/>
-          <w:szCs w:val="24"/>
-        </w:rPr>
-      </w:pPr>
-      <w:r>
-        <w:rPr>
-          <w:rFonts w:ascii="Noto Serif" w:eastAsia="Noto Serif SC" w:hAnsi="Noto Serif" w:cs="Noto Serif"/>
-          <w:color w:val="000000" w:themeColor="text1"/>
-          <w:sz w:val="20"/>
-          <w:szCs w:val="24"/>
-        </w:rPr>
         <w:t>Singapore 068810</w:t>
       </w:r>
-    </w:p>
-    <w:p>
-      <w:pPr>
-        <w:rPr>
-          <w:rFonts w:ascii="Noto Serif" w:eastAsia="Noto Serif SC" w:hAnsi="Noto Serif" w:cs="Noto Serif"/>
-          <w:sz w:val="18"/>
-        </w:rPr>
-      </w:pPr>
     </w:p>
     <w:p>
       <w:pPr>
@@ -1559,49 +1537,21 @@
       </w:pPr>
       <w:r>
         <w:rPr>
-          <w:rFonts w:ascii="Noto Serif" w:eastAsia="Microsoft JhengHei" w:hAnsi="Noto Serif" w:cs="Noto Serif"/>
-          <w:b/>
-          <w:sz w:val="44"/>
-          <w:szCs w:val="44"/>
+          <w:rFonts w:ascii="Noto Serif" w:eastAsia="Noto Serif SC" w:hAnsi="Noto Serif" w:cs="Noto Serif" w:hint="eastAsia"/>
+          <w:noProof/>
+          <w:sz w:val="24"/>
+          <w:szCs w:val="24"/>
+          <w:lang w:val="zh-CN"/>
         </w:rPr>
         <w:lastRenderedPageBreak/>
-        <w:t>传</w:t>
-      </w:r>
-      <w:r>
-        <w:rPr>
-          <w:rFonts w:ascii="Noto Serif" w:eastAsia="Noto Serif SC" w:hAnsi="Noto Serif" w:cs="Noto Serif"/>
-          <w:b/>
-          <w:sz w:val="44"/>
-          <w:szCs w:val="44"/>
-        </w:rPr>
-        <w:t>Biography</w:t>
-      </w:r>
-    </w:p>
-    <w:p>
-      <w:pPr>
-        <w:rPr>
-          <w:rFonts w:ascii="Noto Serif" w:eastAsia="Noto Serif SC" w:hAnsi="Noto Serif" w:cs="Noto Serif"/>
-          <w:sz w:val="24"/>
-          <w:szCs w:val="24"/>
-          <w:lang w:val="en-US"/>
-        </w:rPr>
-      </w:pPr>
-      <w:r>
-        <w:rPr>
-          <w:rFonts w:ascii="Noto Serif" w:eastAsia="Noto Serif SC" w:hAnsi="Noto Serif" w:cs="Noto Serif" w:hint="eastAsia"/>
-          <w:noProof/>
-          <w:sz w:val="24"/>
-          <w:szCs w:val="24"/>
-          <w:lang w:val="zh-CN"/>
-        </w:rPr>
         <w:drawing>
-          <wp:anchor distT="0" distB="0" distL="114300" distR="114300" simplePos="0" relativeHeight="251658240" behindDoc="0" locked="0" layoutInCell="1" allowOverlap="1" wp14:anchorId="0A2F17FF" wp14:editId="324DB068">
+          <wp:anchor distT="0" distB="0" distL="114300" distR="114300" simplePos="0" relativeHeight="251658240" behindDoc="0" locked="0" layoutInCell="1" allowOverlap="1" wp14:anchorId="0A2F17FF" wp14:editId="6B950FA1">
             <wp:simplePos x="0" y="0"/>
             <wp:positionH relativeFrom="column">
-              <wp:posOffset>6051401</wp:posOffset>
+              <wp:posOffset>6050915</wp:posOffset>
             </wp:positionH>
             <wp:positionV relativeFrom="paragraph">
-              <wp:posOffset>13970</wp:posOffset>
+              <wp:posOffset>903605</wp:posOffset>
             </wp:positionV>
             <wp:extent cx="2389505" cy="3583940"/>
             <wp:effectExtent l="0" t="0" r="0" b="0"/>
@@ -1652,6 +1602,34 @@
       </w:r>
       <w:r>
         <w:rPr>
+          <w:rFonts w:ascii="Noto Serif" w:eastAsia="Microsoft JhengHei" w:hAnsi="Noto Serif" w:cs="Noto Serif"/>
+          <w:b/>
+          <w:sz w:val="44"/>
+          <w:szCs w:val="44"/>
+        </w:rPr>
+        <w:t>传</w:t>
+      </w:r>
+      <w:r>
+        <w:rPr>
+          <w:rFonts w:ascii="Noto Serif" w:eastAsia="Noto Serif SC" w:hAnsi="Noto Serif" w:cs="Noto Serif"/>
+          <w:b/>
+          <w:sz w:val="44"/>
+          <w:szCs w:val="44"/>
+        </w:rPr>
+        <w:t>Biography</w:t>
+      </w:r>
+    </w:p>
+    <w:p>
+      <w:pPr>
+        <w:rPr>
+          <w:rFonts w:ascii="Noto Serif" w:eastAsia="Noto Serif SC" w:hAnsi="Noto Serif" w:cs="Noto Serif"/>
+          <w:sz w:val="24"/>
+          <w:szCs w:val="24"/>
+          <w:lang w:val="en-US"/>
+        </w:rPr>
+      </w:pPr>
+      <w:r>
+        <w:rPr>
           <w:rFonts w:ascii="Noto Serif" w:eastAsia="Noto Serif SC" w:hAnsi="Noto Serif" w:cs="Noto Serif" w:hint="eastAsia"/>
           <w:sz w:val="24"/>
           <w:szCs w:val="24"/>
@@ -5418,7 +5396,6 @@
           <w:rFonts w:ascii="Noto Serif" w:eastAsia="Noto Serif SC" w:hAnsi="Noto Serif" w:cs="Noto Serif"/>
           <w:sz w:val="24"/>
           <w:szCs w:val="24"/>
-          <w:lang w:val="en-US"/>
         </w:rPr>
       </w:pPr>
       <w:r>

</xml_diff>

<commit_message>
SCO Piece 7 and 9 templates done. Fixed few types in piece 9
</commit_message>
<xml_diff>
--- a/Front Matter/Template/6_Front-Matter_Template-v4.docx
+++ b/Front Matter/Template/6_Front-Matter_Template-v4.docx
@@ -41,7 +41,7 @@
       <w:pPr>
         <w:jc w:val="right"/>
         <w:rPr>
-          <w:rFonts w:ascii="Noto Serif" w:eastAsia="Noto Serif SC" w:hAnsi="Noto Serif" w:cs="Noto Serif"/>
+          <w:rFonts w:ascii="Noto Serif SC" w:eastAsia="Noto Serif SC" w:hAnsi="Noto Serif SC" w:cs="Noto Serif"/>
           <w:b/>
           <w:sz w:val="60"/>
           <w:szCs w:val="60"/>
@@ -50,66 +50,12 @@
       </w:pPr>
       <w:r>
         <w:rPr>
-          <w:rFonts w:ascii="Noto Serif" w:eastAsia="Noto Serif SC" w:hAnsi="Noto Serif" w:cs="Noto Serif" w:hint="eastAsia"/>
+          <w:rFonts w:ascii="Noto Serif SC" w:eastAsia="Noto Serif SC" w:hAnsi="Noto Serif SC" w:cs="Noto Serif" w:hint="eastAsia"/>
           <w:b/>
           <w:sz w:val="60"/>
           <w:szCs w:val="60"/>
         </w:rPr>
-        <w:t>山</w:t>
-      </w:r>
-      <w:r>
-        <w:rPr>
-          <w:rFonts w:ascii="Noto Serif" w:eastAsia="Noto Serif SC" w:hAnsi="Noto Serif" w:cs="Noto Serif" w:hint="eastAsia"/>
-          <w:b/>
-          <w:sz w:val="60"/>
-          <w:szCs w:val="60"/>
-        </w:rPr>
-        <w:t xml:space="preserve"> </w:t>
-      </w:r>
-      <w:r>
-        <w:rPr>
-          <w:rFonts w:ascii="Noto Serif" w:eastAsia="Noto Serif SC" w:hAnsi="Noto Serif" w:cs="Noto Serif" w:hint="eastAsia"/>
-          <w:b/>
-          <w:sz w:val="60"/>
-          <w:szCs w:val="60"/>
-        </w:rPr>
-        <w:t>谣</w:t>
-      </w:r>
-      <w:r>
-        <w:rPr>
-          <w:rFonts w:ascii="Noto Serif" w:eastAsia="Noto Serif SC" w:hAnsi="Noto Serif" w:cs="Noto Serif" w:hint="eastAsia"/>
-          <w:b/>
-          <w:sz w:val="60"/>
-          <w:szCs w:val="60"/>
-        </w:rPr>
-        <w:t xml:space="preserve"> </w:t>
-      </w:r>
-      <w:r>
-        <w:rPr>
-          <w:rFonts w:ascii="Noto Serif" w:eastAsia="Noto Serif SC" w:hAnsi="Noto Serif" w:cs="Noto Serif" w:hint="eastAsia"/>
-          <w:b/>
-          <w:sz w:val="60"/>
-          <w:szCs w:val="60"/>
-        </w:rPr>
-        <w:t>随</w:t>
-      </w:r>
-      <w:r>
-        <w:rPr>
-          <w:rFonts w:ascii="Noto Serif" w:eastAsia="Noto Serif SC" w:hAnsi="Noto Serif" w:cs="Noto Serif" w:hint="eastAsia"/>
-          <w:b/>
-          <w:sz w:val="60"/>
-          <w:szCs w:val="60"/>
-        </w:rPr>
-        <w:t xml:space="preserve"> </w:t>
-      </w:r>
-      <w:r>
-        <w:rPr>
-          <w:rFonts w:ascii="Noto Serif" w:eastAsia="Noto Serif SC" w:hAnsi="Noto Serif" w:cs="Noto Serif" w:hint="eastAsia"/>
-          <w:b/>
-          <w:sz w:val="60"/>
-          <w:szCs w:val="60"/>
-        </w:rPr>
-        <w:t>想</w:t>
+        <w:t>山 谣 随 想</w:t>
       </w:r>
     </w:p>
     <w:p>
@@ -770,7 +716,7 @@
       <w:pPr>
         <w:jc w:val="right"/>
         <w:rPr>
-          <w:rFonts w:ascii="Noto Serif" w:eastAsia="Noto Serif SC" w:hAnsi="Noto Serif" w:cs="Noto Serif"/>
+          <w:rFonts w:ascii="Noto Serif SC" w:eastAsia="Noto Serif SC" w:hAnsi="Noto Serif SC" w:cs="Noto Serif"/>
           <w:b/>
           <w:sz w:val="60"/>
           <w:szCs w:val="60"/>
@@ -779,66 +725,12 @@
       </w:pPr>
       <w:r>
         <w:rPr>
-          <w:rFonts w:ascii="Noto Serif" w:eastAsia="Noto Serif SC" w:hAnsi="Noto Serif" w:cs="Noto Serif" w:hint="eastAsia"/>
+          <w:rFonts w:ascii="Noto Serif SC" w:eastAsia="Noto Serif SC" w:hAnsi="Noto Serif SC" w:cs="Noto Serif" w:hint="eastAsia"/>
           <w:b/>
           <w:sz w:val="60"/>
           <w:szCs w:val="60"/>
         </w:rPr>
-        <w:t>山</w:t>
-      </w:r>
-      <w:r>
-        <w:rPr>
-          <w:rFonts w:ascii="Noto Serif" w:eastAsia="Noto Serif SC" w:hAnsi="Noto Serif" w:cs="Noto Serif" w:hint="eastAsia"/>
-          <w:b/>
-          <w:sz w:val="60"/>
-          <w:szCs w:val="60"/>
-        </w:rPr>
-        <w:t xml:space="preserve"> </w:t>
-      </w:r>
-      <w:r>
-        <w:rPr>
-          <w:rFonts w:ascii="Noto Serif" w:eastAsia="Noto Serif SC" w:hAnsi="Noto Serif" w:cs="Noto Serif" w:hint="eastAsia"/>
-          <w:b/>
-          <w:sz w:val="60"/>
-          <w:szCs w:val="60"/>
-        </w:rPr>
-        <w:t>谣</w:t>
-      </w:r>
-      <w:r>
-        <w:rPr>
-          <w:rFonts w:ascii="Noto Serif" w:eastAsia="Noto Serif SC" w:hAnsi="Noto Serif" w:cs="Noto Serif" w:hint="eastAsia"/>
-          <w:b/>
-          <w:sz w:val="60"/>
-          <w:szCs w:val="60"/>
-        </w:rPr>
-        <w:t xml:space="preserve"> </w:t>
-      </w:r>
-      <w:r>
-        <w:rPr>
-          <w:rFonts w:ascii="Noto Serif" w:eastAsia="Noto Serif SC" w:hAnsi="Noto Serif" w:cs="Noto Serif" w:hint="eastAsia"/>
-          <w:b/>
-          <w:sz w:val="60"/>
-          <w:szCs w:val="60"/>
-        </w:rPr>
-        <w:t>随</w:t>
-      </w:r>
-      <w:r>
-        <w:rPr>
-          <w:rFonts w:ascii="Noto Serif" w:eastAsia="Noto Serif SC" w:hAnsi="Noto Serif" w:cs="Noto Serif" w:hint="eastAsia"/>
-          <w:b/>
-          <w:sz w:val="60"/>
-          <w:szCs w:val="60"/>
-        </w:rPr>
-        <w:t xml:space="preserve"> </w:t>
-      </w:r>
-      <w:r>
-        <w:rPr>
-          <w:rFonts w:ascii="Noto Serif" w:eastAsia="Noto Serif SC" w:hAnsi="Noto Serif" w:cs="Noto Serif" w:hint="eastAsia"/>
-          <w:b/>
-          <w:sz w:val="60"/>
-          <w:szCs w:val="60"/>
-        </w:rPr>
-        <w:t>想</w:t>
+        <w:t>山 谣 随 想</w:t>
       </w:r>
     </w:p>
     <w:p>
@@ -4626,7 +4518,47 @@
           <w:szCs w:val="24"/>
           <w:lang w:val="en-US"/>
         </w:rPr>
-        <w:t>(</w:t>
+        <w:t>(Diyin Sheng)</w:t>
+      </w:r>
+    </w:p>
+    <w:p>
+      <w:pPr>
+        <w:jc w:val="right"/>
+        <w:rPr>
+          <w:rFonts w:ascii="Noto Serif" w:eastAsia="Noto Serif SC" w:hAnsi="Noto Serif" w:cs="Noto Serif"/>
+          <w:sz w:val="24"/>
+          <w:szCs w:val="24"/>
+          <w:lang w:val="en-US"/>
+        </w:rPr>
+      </w:pPr>
+    </w:p>
+    <w:p>
+      <w:pPr>
+        <w:jc w:val="right"/>
+        <w:rPr>
+          <w:rFonts w:ascii="Noto Serif" w:eastAsia="Noto Serif SC" w:hAnsi="Noto Serif" w:cs="Noto Serif"/>
+          <w:sz w:val="24"/>
+          <w:szCs w:val="24"/>
+          <w:lang w:val="en-US"/>
+        </w:rPr>
+      </w:pPr>
+      <w:r>
+        <w:rPr>
+          <w:rFonts w:ascii="Noto Serif" w:eastAsia="Noto Serif SC" w:hAnsi="Noto Serif" w:cs="Noto Serif"/>
+          <w:sz w:val="24"/>
+          <w:szCs w:val="24"/>
+          <w:lang w:val="en-US"/>
+        </w:rPr>
+        <w:t>高音唢呐</w:t>
+      </w:r>
+      <w:r>
+        <w:rPr>
+          <w:rFonts w:ascii="Noto Serif" w:eastAsia="Noto Serif SC" w:hAnsi="Noto Serif" w:cs="Noto Serif"/>
+          <w:sz w:val="24"/>
+          <w:szCs w:val="24"/>
+          <w:lang w:val="en-US"/>
+        </w:rPr>
+        <w:t xml:space="preserve"> I, II (</w:t>
       </w:r>
       <w:proofErr w:type="spellStart"/>
       <w:r>
@@ -4636,7 +4568,7 @@
           <w:szCs w:val="24"/>
           <w:lang w:val="en-US"/>
         </w:rPr>
-        <w:t>Diyin</w:t>
+        <w:t>Gaoyin</w:t>
       </w:r>
       <w:proofErr w:type="spellEnd"/>
       <w:r>
@@ -4646,7 +4578,27 @@
           <w:szCs w:val="24"/>
           <w:lang w:val="en-US"/>
         </w:rPr>
-        <w:t xml:space="preserve"> Sheng)</w:t>
+        <w:t xml:space="preserve"> </w:t>
+      </w:r>
+      <w:proofErr w:type="spellStart"/>
+      <w:r>
+        <w:rPr>
+          <w:rFonts w:ascii="Noto Serif" w:eastAsia="Noto Serif SC" w:hAnsi="Noto Serif" w:cs="Noto Serif"/>
+          <w:sz w:val="24"/>
+          <w:szCs w:val="24"/>
+          <w:lang w:val="en-US"/>
+        </w:rPr>
+        <w:t>Suona</w:t>
+      </w:r>
+      <w:proofErr w:type="spellEnd"/>
+      <w:r>
+        <w:rPr>
+          <w:rFonts w:ascii="Noto Serif" w:eastAsia="Noto Serif SC" w:hAnsi="Noto Serif" w:cs="Noto Serif"/>
+          <w:sz w:val="24"/>
+          <w:szCs w:val="24"/>
+          <w:lang w:val="en-US"/>
+        </w:rPr>
+        <w:t xml:space="preserve"> I, II)</w:t>
       </w:r>
     </w:p>
     <w:p>
@@ -4659,6 +4611,64 @@
           <w:lang w:val="en-US"/>
         </w:rPr>
       </w:pPr>
+      <w:r>
+        <w:rPr>
+          <w:rFonts w:ascii="Noto Serif" w:eastAsia="Noto Serif SC" w:hAnsi="Noto Serif" w:cs="Noto Serif"/>
+          <w:sz w:val="24"/>
+          <w:szCs w:val="24"/>
+          <w:lang w:val="en-US"/>
+        </w:rPr>
+        <w:t>中音唢呐</w:t>
+      </w:r>
+      <w:r>
+        <w:rPr>
+          <w:rFonts w:ascii="Noto Serif" w:eastAsia="Noto Serif SC" w:hAnsi="Noto Serif" w:cs="Noto Serif"/>
+          <w:sz w:val="24"/>
+          <w:szCs w:val="24"/>
+          <w:lang w:val="en-US"/>
+        </w:rPr>
+        <w:t xml:space="preserve"> (</w:t>
+      </w:r>
+      <w:proofErr w:type="spellStart"/>
+      <w:r>
+        <w:rPr>
+          <w:rFonts w:ascii="Noto Serif" w:eastAsia="Noto Serif SC" w:hAnsi="Noto Serif" w:cs="Noto Serif"/>
+          <w:sz w:val="24"/>
+          <w:szCs w:val="24"/>
+          <w:lang w:val="en-US"/>
+        </w:rPr>
+        <w:t>Zhongyin</w:t>
+      </w:r>
+      <w:proofErr w:type="spellEnd"/>
+      <w:r>
+        <w:rPr>
+          <w:rFonts w:ascii="Noto Serif" w:eastAsia="Noto Serif SC" w:hAnsi="Noto Serif" w:cs="Noto Serif"/>
+          <w:sz w:val="24"/>
+          <w:szCs w:val="24"/>
+          <w:lang w:val="en-US"/>
+        </w:rPr>
+        <w:t xml:space="preserve"> </w:t>
+      </w:r>
+      <w:proofErr w:type="spellStart"/>
+      <w:r>
+        <w:rPr>
+          <w:rFonts w:ascii="Noto Serif" w:eastAsia="Noto Serif SC" w:hAnsi="Noto Serif" w:cs="Noto Serif"/>
+          <w:sz w:val="24"/>
+          <w:szCs w:val="24"/>
+          <w:lang w:val="en-US"/>
+        </w:rPr>
+        <w:t>Suona</w:t>
+      </w:r>
+      <w:proofErr w:type="spellEnd"/>
+      <w:r>
+        <w:rPr>
+          <w:rFonts w:ascii="Noto Serif" w:eastAsia="Noto Serif SC" w:hAnsi="Noto Serif" w:cs="Noto Serif"/>
+          <w:sz w:val="24"/>
+          <w:szCs w:val="24"/>
+          <w:lang w:val="en-US"/>
+        </w:rPr>
+        <w:t>)</w:t>
+      </w:r>
     </w:p>
     <w:p>
       <w:pPr>
@@ -4677,16 +4687,16 @@
           <w:szCs w:val="24"/>
           <w:lang w:val="en-US"/>
         </w:rPr>
-        <w:t>高音唢呐</w:t>
-      </w:r>
-      <w:r>
-        <w:rPr>
-          <w:rFonts w:ascii="Noto Serif" w:eastAsia="Noto Serif SC" w:hAnsi="Noto Serif" w:cs="Noto Serif"/>
-          <w:sz w:val="24"/>
-          <w:szCs w:val="24"/>
-          <w:lang w:val="en-US"/>
-        </w:rPr>
-        <w:t xml:space="preserve"> I, II (</w:t>
+        <w:t>低音唢呐</w:t>
+      </w:r>
+      <w:r>
+        <w:rPr>
+          <w:rFonts w:ascii="Noto Serif" w:eastAsia="Noto Serif SC" w:hAnsi="Noto Serif" w:cs="Noto Serif"/>
+          <w:sz w:val="24"/>
+          <w:szCs w:val="24"/>
+          <w:lang w:val="en-US"/>
+        </w:rPr>
+        <w:t xml:space="preserve"> (Diyin </w:t>
       </w:r>
       <w:proofErr w:type="spellStart"/>
       <w:r>
@@ -4696,7 +4706,7 @@
           <w:szCs w:val="24"/>
           <w:lang w:val="en-US"/>
         </w:rPr>
-        <w:t>Gaoyin</w:t>
+        <w:t>Suona</w:t>
       </w:r>
       <w:proofErr w:type="spellEnd"/>
       <w:r>
@@ -4706,7 +4716,76 @@
           <w:szCs w:val="24"/>
           <w:lang w:val="en-US"/>
         </w:rPr>
-        <w:t xml:space="preserve"> </w:t>
+        <w:t>)</w:t>
+      </w:r>
+    </w:p>
+    <w:p>
+      <w:pPr>
+        <w:jc w:val="right"/>
+        <w:rPr>
+          <w:rFonts w:ascii="Noto Serif" w:eastAsia="Noto Serif SC" w:hAnsi="Noto Serif" w:cs="Noto Serif"/>
+          <w:sz w:val="24"/>
+          <w:szCs w:val="24"/>
+          <w:lang w:val="en-US"/>
+        </w:rPr>
+      </w:pPr>
+    </w:p>
+    <w:p>
+      <w:pPr>
+        <w:jc w:val="right"/>
+        <w:rPr>
+          <w:rFonts w:ascii="Noto Serif" w:eastAsia="Noto Serif SC" w:hAnsi="Noto Serif" w:cs="Noto Serif"/>
+          <w:sz w:val="24"/>
+          <w:szCs w:val="24"/>
+          <w:lang w:val="en-US"/>
+        </w:rPr>
+      </w:pPr>
+      <w:r>
+        <w:rPr>
+          <w:rFonts w:ascii="Noto Serif" w:eastAsia="Noto Serif SC" w:hAnsi="Noto Serif" w:cs="Noto Serif"/>
+          <w:sz w:val="24"/>
+          <w:szCs w:val="24"/>
+          <w:lang w:val="en-US"/>
+        </w:rPr>
+        <w:t>扬琴</w:t>
+      </w:r>
+      <w:r>
+        <w:rPr>
+          <w:rFonts w:ascii="Noto Serif" w:eastAsia="Noto Serif SC" w:hAnsi="Noto Serif" w:cs="Noto Serif"/>
+          <w:sz w:val="24"/>
+          <w:szCs w:val="24"/>
+          <w:lang w:val="en-US"/>
+        </w:rPr>
+        <w:t xml:space="preserve"> (Yangqin)</w:t>
+      </w:r>
+    </w:p>
+    <w:p>
+      <w:pPr>
+        <w:jc w:val="right"/>
+        <w:rPr>
+          <w:rFonts w:ascii="Noto Serif" w:eastAsia="Noto Serif SC" w:hAnsi="Noto Serif" w:cs="Noto Serif"/>
+          <w:sz w:val="24"/>
+          <w:szCs w:val="24"/>
+          <w:lang w:val="en-US"/>
+        </w:rPr>
+      </w:pPr>
+      <w:r>
+        <w:rPr>
+          <w:rFonts w:ascii="Noto Serif" w:eastAsia="Noto Serif SC" w:hAnsi="Noto Serif" w:cs="Noto Serif"/>
+          <w:sz w:val="24"/>
+          <w:szCs w:val="24"/>
+          <w:lang w:val="en-US"/>
+        </w:rPr>
+        <w:t>柳琴</w:t>
+      </w:r>
+      <w:r>
+        <w:rPr>
+          <w:rFonts w:ascii="Noto Serif" w:eastAsia="Noto Serif SC" w:hAnsi="Noto Serif" w:cs="Noto Serif"/>
+          <w:sz w:val="24"/>
+          <w:szCs w:val="24"/>
+          <w:lang w:val="en-US"/>
+        </w:rPr>
+        <w:t xml:space="preserve"> (</w:t>
       </w:r>
       <w:proofErr w:type="spellStart"/>
       <w:r>
@@ -4716,7 +4795,7 @@
           <w:szCs w:val="24"/>
           <w:lang w:val="en-US"/>
         </w:rPr>
-        <w:t>Suona</w:t>
+        <w:t>Liuqin</w:t>
       </w:r>
       <w:proofErr w:type="spellEnd"/>
       <w:r>
@@ -4726,7 +4805,7 @@
           <w:szCs w:val="24"/>
           <w:lang w:val="en-US"/>
         </w:rPr>
-        <w:t xml:space="preserve"> I, II)</w:t>
+        <w:t>)</w:t>
       </w:r>
     </w:p>
     <w:p>
@@ -4746,14 +4825,157 @@
           <w:szCs w:val="24"/>
           <w:lang w:val="en-US"/>
         </w:rPr>
-        <w:t>中音唢呐</w:t>
-      </w:r>
-      <w:r>
-        <w:rPr>
-          <w:rFonts w:ascii="Noto Serif" w:eastAsia="Noto Serif SC" w:hAnsi="Noto Serif" w:cs="Noto Serif"/>
-          <w:sz w:val="24"/>
-          <w:szCs w:val="24"/>
-          <w:lang w:val="en-US"/>
+        <w:t>琵琶</w:t>
+      </w:r>
+      <w:r>
+        <w:rPr>
+          <w:rFonts w:ascii="Noto Serif" w:eastAsia="Noto Serif SC" w:hAnsi="Noto Serif" w:cs="Noto Serif"/>
+          <w:sz w:val="24"/>
+          <w:szCs w:val="24"/>
+          <w:lang w:val="en-US"/>
+        </w:rPr>
+        <w:t xml:space="preserve"> (Pipa)</w:t>
+      </w:r>
+    </w:p>
+    <w:p>
+      <w:pPr>
+        <w:jc w:val="right"/>
+        <w:rPr>
+          <w:rFonts w:ascii="Noto Serif" w:eastAsia="Noto Serif SC" w:hAnsi="Noto Serif" w:cs="Noto Serif"/>
+          <w:sz w:val="24"/>
+          <w:szCs w:val="24"/>
+          <w:lang w:val="en-US"/>
+        </w:rPr>
+      </w:pPr>
+      <w:r>
+        <w:rPr>
+          <w:rFonts w:ascii="Noto Serif" w:eastAsia="Noto Serif SC" w:hAnsi="Noto Serif" w:cs="Noto Serif"/>
+          <w:sz w:val="24"/>
+          <w:szCs w:val="24"/>
+          <w:lang w:val="en-US"/>
+        </w:rPr>
+        <w:t>中阮</w:t>
+      </w:r>
+      <w:r>
+        <w:rPr>
+          <w:rFonts w:ascii="Noto Serif" w:eastAsia="Noto Serif SC" w:hAnsi="Noto Serif" w:cs="Noto Serif"/>
+          <w:sz w:val="24"/>
+          <w:szCs w:val="24"/>
+          <w:lang w:val="en-US"/>
+        </w:rPr>
+        <w:t xml:space="preserve"> (Zhongruan)</w:t>
+      </w:r>
+    </w:p>
+    <w:p>
+      <w:pPr>
+        <w:jc w:val="right"/>
+        <w:rPr>
+          <w:rFonts w:ascii="Noto Serif" w:eastAsia="Noto Serif SC" w:hAnsi="Noto Serif" w:cs="Noto Serif"/>
+          <w:sz w:val="24"/>
+          <w:szCs w:val="24"/>
+          <w:lang w:val="en-US"/>
+        </w:rPr>
+      </w:pPr>
+      <w:r>
+        <w:rPr>
+          <w:rFonts w:ascii="Noto Serif" w:eastAsia="Noto Serif SC" w:hAnsi="Noto Serif" w:cs="Noto Serif"/>
+          <w:sz w:val="24"/>
+          <w:szCs w:val="24"/>
+          <w:lang w:val="en-US"/>
+        </w:rPr>
+        <w:t>大阮</w:t>
+      </w:r>
+      <w:r>
+        <w:rPr>
+          <w:rFonts w:ascii="Noto Serif" w:eastAsia="Noto Serif SC" w:hAnsi="Noto Serif" w:cs="Noto Serif"/>
+          <w:sz w:val="24"/>
+          <w:szCs w:val="24"/>
+          <w:lang w:val="en-US"/>
+        </w:rPr>
+        <w:t xml:space="preserve"> (Daruan)</w:t>
+      </w:r>
+    </w:p>
+    <w:p>
+      <w:pPr>
+        <w:jc w:val="right"/>
+        <w:rPr>
+          <w:rFonts w:ascii="Noto Serif" w:eastAsia="Noto Serif SC" w:hAnsi="Noto Serif" w:cs="Noto Serif"/>
+          <w:sz w:val="24"/>
+          <w:szCs w:val="24"/>
+          <w:lang w:val="en-US"/>
+        </w:rPr>
+      </w:pPr>
+    </w:p>
+    <w:p>
+      <w:pPr>
+        <w:jc w:val="right"/>
+        <w:rPr>
+          <w:rFonts w:ascii="Noto Serif" w:eastAsia="Noto Serif SC" w:hAnsi="Noto Serif" w:cs="Noto Serif"/>
+          <w:sz w:val="24"/>
+          <w:szCs w:val="24"/>
+          <w:lang w:val="en-US"/>
+        </w:rPr>
+      </w:pPr>
+      <w:r>
+        <w:rPr>
+          <w:rFonts w:ascii="Noto Serif" w:eastAsia="Noto Serif SC" w:hAnsi="Noto Serif" w:cs="Noto Serif"/>
+          <w:sz w:val="24"/>
+          <w:szCs w:val="24"/>
+          <w:lang w:val="en-US"/>
+        </w:rPr>
+        <w:t>定音鼓</w:t>
+      </w:r>
+      <w:r>
+        <w:rPr>
+          <w:rFonts w:ascii="Noto Serif" w:eastAsia="Noto Serif SC" w:hAnsi="Noto Serif" w:cs="Noto Serif"/>
+          <w:sz w:val="24"/>
+          <w:szCs w:val="24"/>
+          <w:lang w:val="en-US"/>
+        </w:rPr>
+        <w:t xml:space="preserve"> (Timpani)</w:t>
+      </w:r>
+    </w:p>
+    <w:p>
+      <w:pPr>
+        <w:jc w:val="right"/>
+        <w:rPr>
+          <w:rFonts w:ascii="Noto Serif" w:eastAsia="Noto Serif SC" w:hAnsi="Noto Serif" w:cs="Noto Serif"/>
+          <w:sz w:val="24"/>
+          <w:szCs w:val="24"/>
+          <w:lang w:val="en-US"/>
+        </w:rPr>
+      </w:pPr>
+      <w:r>
+        <w:rPr>
+          <w:rFonts w:ascii="Noto Serif" w:eastAsia="Noto Serif SC" w:hAnsi="Noto Serif" w:cs="Noto Serif"/>
+          <w:sz w:val="24"/>
+          <w:szCs w:val="24"/>
+          <w:lang w:val="en-US"/>
+        </w:rPr>
+        <w:t>打击乐</w:t>
+      </w:r>
+      <w:r>
+        <w:rPr>
+          <w:rFonts w:ascii="Noto Serif" w:eastAsia="Noto Serif SC" w:hAnsi="Noto Serif" w:cs="Noto Serif"/>
+          <w:sz w:val="24"/>
+          <w:szCs w:val="24"/>
+          <w:lang w:val="en-US"/>
+        </w:rPr>
+        <w:t xml:space="preserve"> I (Percussion I): </w:t>
+      </w:r>
+      <w:r>
+        <w:rPr>
+          <w:rFonts w:ascii="Noto Serif" w:eastAsia="Noto Serif SC" w:hAnsi="Noto Serif" w:cs="Noto Serif"/>
+          <w:sz w:val="24"/>
+          <w:szCs w:val="24"/>
+        </w:rPr>
+        <w:t>中国大鼓</w:t>
+      </w:r>
+      <w:r>
+        <w:rPr>
+          <w:rFonts w:ascii="Noto Serif" w:eastAsia="Noto Serif SC" w:hAnsi="Noto Serif" w:cs="Noto Serif"/>
+          <w:sz w:val="24"/>
+          <w:szCs w:val="24"/>
         </w:rPr>
         <w:t xml:space="preserve"> (</w:t>
       </w:r>
@@ -4763,9 +4985,8 @@
           <w:rFonts w:ascii="Noto Serif" w:eastAsia="Noto Serif SC" w:hAnsi="Noto Serif" w:cs="Noto Serif"/>
           <w:sz w:val="24"/>
           <w:szCs w:val="24"/>
-          <w:lang w:val="en-US"/>
-        </w:rPr>
-        <w:t>Zhongyin</w:t>
+        </w:rPr>
+        <w:t>Zhongguo</w:t>
       </w:r>
       <w:proofErr w:type="spellEnd"/>
       <w:r>
@@ -4773,395 +4994,8 @@
           <w:rFonts w:ascii="Noto Serif" w:eastAsia="Noto Serif SC" w:hAnsi="Noto Serif" w:cs="Noto Serif"/>
           <w:sz w:val="24"/>
           <w:szCs w:val="24"/>
-          <w:lang w:val="en-US"/>
-        </w:rPr>
-        <w:t xml:space="preserve"> </w:t>
-      </w:r>
-      <w:proofErr w:type="spellStart"/>
-      <w:r>
-        <w:rPr>
-          <w:rFonts w:ascii="Noto Serif" w:eastAsia="Noto Serif SC" w:hAnsi="Noto Serif" w:cs="Noto Serif"/>
-          <w:sz w:val="24"/>
-          <w:szCs w:val="24"/>
-          <w:lang w:val="en-US"/>
-        </w:rPr>
-        <w:t>Suona</w:t>
-      </w:r>
-      <w:proofErr w:type="spellEnd"/>
-      <w:r>
-        <w:rPr>
-          <w:rFonts w:ascii="Noto Serif" w:eastAsia="Noto Serif SC" w:hAnsi="Noto Serif" w:cs="Noto Serif"/>
-          <w:sz w:val="24"/>
-          <w:szCs w:val="24"/>
-          <w:lang w:val="en-US"/>
-        </w:rPr>
-        <w:t>)</w:t>
-      </w:r>
-    </w:p>
-    <w:p>
-      <w:pPr>
-        <w:jc w:val="right"/>
-        <w:rPr>
-          <w:rFonts w:ascii="Noto Serif" w:eastAsia="Noto Serif SC" w:hAnsi="Noto Serif" w:cs="Noto Serif"/>
-          <w:sz w:val="24"/>
-          <w:szCs w:val="24"/>
-          <w:lang w:val="en-US"/>
-        </w:rPr>
-      </w:pPr>
-      <w:r>
-        <w:rPr>
-          <w:rFonts w:ascii="Noto Serif" w:eastAsia="Noto Serif SC" w:hAnsi="Noto Serif" w:cs="Noto Serif"/>
-          <w:sz w:val="24"/>
-          <w:szCs w:val="24"/>
-          <w:lang w:val="en-US"/>
-        </w:rPr>
-        <w:t>低音唢呐</w:t>
-      </w:r>
-      <w:r>
-        <w:rPr>
-          <w:rFonts w:ascii="Noto Serif" w:eastAsia="Noto Serif SC" w:hAnsi="Noto Serif" w:cs="Noto Serif"/>
-          <w:sz w:val="24"/>
-          <w:szCs w:val="24"/>
-          <w:lang w:val="en-US"/>
-        </w:rPr>
-        <w:t xml:space="preserve"> (</w:t>
-      </w:r>
-      <w:proofErr w:type="spellStart"/>
-      <w:r>
-        <w:rPr>
-          <w:rFonts w:ascii="Noto Serif" w:eastAsia="Noto Serif SC" w:hAnsi="Noto Serif" w:cs="Noto Serif"/>
-          <w:sz w:val="24"/>
-          <w:szCs w:val="24"/>
-          <w:lang w:val="en-US"/>
-        </w:rPr>
-        <w:t>Diyin</w:t>
-      </w:r>
-      <w:proofErr w:type="spellEnd"/>
-      <w:r>
-        <w:rPr>
-          <w:rFonts w:ascii="Noto Serif" w:eastAsia="Noto Serif SC" w:hAnsi="Noto Serif" w:cs="Noto Serif"/>
-          <w:sz w:val="24"/>
-          <w:szCs w:val="24"/>
-          <w:lang w:val="en-US"/>
-        </w:rPr>
-        <w:t xml:space="preserve"> </w:t>
-      </w:r>
-      <w:proofErr w:type="spellStart"/>
-      <w:r>
-        <w:rPr>
-          <w:rFonts w:ascii="Noto Serif" w:eastAsia="Noto Serif SC" w:hAnsi="Noto Serif" w:cs="Noto Serif"/>
-          <w:sz w:val="24"/>
-          <w:szCs w:val="24"/>
-          <w:lang w:val="en-US"/>
-        </w:rPr>
-        <w:t>Suona</w:t>
-      </w:r>
-      <w:proofErr w:type="spellEnd"/>
-      <w:r>
-        <w:rPr>
-          <w:rFonts w:ascii="Noto Serif" w:eastAsia="Noto Serif SC" w:hAnsi="Noto Serif" w:cs="Noto Serif"/>
-          <w:sz w:val="24"/>
-          <w:szCs w:val="24"/>
-          <w:lang w:val="en-US"/>
-        </w:rPr>
-        <w:t>)</w:t>
-      </w:r>
-    </w:p>
-    <w:p>
-      <w:pPr>
-        <w:jc w:val="right"/>
-        <w:rPr>
-          <w:rFonts w:ascii="Noto Serif" w:eastAsia="Noto Serif SC" w:hAnsi="Noto Serif" w:cs="Noto Serif"/>
-          <w:sz w:val="24"/>
-          <w:szCs w:val="24"/>
-          <w:lang w:val="en-US"/>
-        </w:rPr>
-      </w:pPr>
-    </w:p>
-    <w:p>
-      <w:pPr>
-        <w:jc w:val="right"/>
-        <w:rPr>
-          <w:rFonts w:ascii="Noto Serif" w:eastAsia="Noto Serif SC" w:hAnsi="Noto Serif" w:cs="Noto Serif"/>
-          <w:sz w:val="24"/>
-          <w:szCs w:val="24"/>
-          <w:lang w:val="en-US"/>
-        </w:rPr>
-      </w:pPr>
-      <w:r>
-        <w:rPr>
-          <w:rFonts w:ascii="Noto Serif" w:eastAsia="Noto Serif SC" w:hAnsi="Noto Serif" w:cs="Noto Serif"/>
-          <w:sz w:val="24"/>
-          <w:szCs w:val="24"/>
-          <w:lang w:val="en-US"/>
-        </w:rPr>
-        <w:t>扬琴</w:t>
-      </w:r>
-      <w:r>
-        <w:rPr>
-          <w:rFonts w:ascii="Noto Serif" w:eastAsia="Noto Serif SC" w:hAnsi="Noto Serif" w:cs="Noto Serif"/>
-          <w:sz w:val="24"/>
-          <w:szCs w:val="24"/>
-          <w:lang w:val="en-US"/>
-        </w:rPr>
-        <w:t xml:space="preserve"> (Yangqin)</w:t>
-      </w:r>
-    </w:p>
-    <w:p>
-      <w:pPr>
-        <w:jc w:val="right"/>
-        <w:rPr>
-          <w:rFonts w:ascii="Noto Serif" w:eastAsia="Noto Serif SC" w:hAnsi="Noto Serif" w:cs="Noto Serif"/>
-          <w:sz w:val="24"/>
-          <w:szCs w:val="24"/>
-          <w:lang w:val="en-US"/>
-        </w:rPr>
-      </w:pPr>
-      <w:r>
-        <w:rPr>
-          <w:rFonts w:ascii="Noto Serif" w:eastAsia="Noto Serif SC" w:hAnsi="Noto Serif" w:cs="Noto Serif"/>
-          <w:sz w:val="24"/>
-          <w:szCs w:val="24"/>
-          <w:lang w:val="en-US"/>
-        </w:rPr>
-        <w:t>柳琴</w:t>
-      </w:r>
-      <w:r>
-        <w:rPr>
-          <w:rFonts w:ascii="Noto Serif" w:eastAsia="Noto Serif SC" w:hAnsi="Noto Serif" w:cs="Noto Serif"/>
-          <w:sz w:val="24"/>
-          <w:szCs w:val="24"/>
-          <w:lang w:val="en-US"/>
-        </w:rPr>
-        <w:t xml:space="preserve"> (</w:t>
-      </w:r>
-      <w:proofErr w:type="spellStart"/>
-      <w:r>
-        <w:rPr>
-          <w:rFonts w:ascii="Noto Serif" w:eastAsia="Noto Serif SC" w:hAnsi="Noto Serif" w:cs="Noto Serif"/>
-          <w:sz w:val="24"/>
-          <w:szCs w:val="24"/>
-          <w:lang w:val="en-US"/>
-        </w:rPr>
-        <w:t>Liuqin</w:t>
-      </w:r>
-      <w:proofErr w:type="spellEnd"/>
-      <w:r>
-        <w:rPr>
-          <w:rFonts w:ascii="Noto Serif" w:eastAsia="Noto Serif SC" w:hAnsi="Noto Serif" w:cs="Noto Serif"/>
-          <w:sz w:val="24"/>
-          <w:szCs w:val="24"/>
-          <w:lang w:val="en-US"/>
-        </w:rPr>
-        <w:t>)</w:t>
-      </w:r>
-    </w:p>
-    <w:p>
-      <w:pPr>
-        <w:jc w:val="right"/>
-        <w:rPr>
-          <w:rFonts w:ascii="Noto Serif" w:eastAsia="Noto Serif SC" w:hAnsi="Noto Serif" w:cs="Noto Serif"/>
-          <w:sz w:val="24"/>
-          <w:szCs w:val="24"/>
-          <w:lang w:val="en-US"/>
-        </w:rPr>
-      </w:pPr>
-      <w:r>
-        <w:rPr>
-          <w:rFonts w:ascii="Noto Serif" w:eastAsia="Noto Serif SC" w:hAnsi="Noto Serif" w:cs="Noto Serif"/>
-          <w:sz w:val="24"/>
-          <w:szCs w:val="24"/>
-          <w:lang w:val="en-US"/>
-        </w:rPr>
-        <w:t>琵琶</w:t>
-      </w:r>
-      <w:r>
-        <w:rPr>
-          <w:rFonts w:ascii="Noto Serif" w:eastAsia="Noto Serif SC" w:hAnsi="Noto Serif" w:cs="Noto Serif"/>
-          <w:sz w:val="24"/>
-          <w:szCs w:val="24"/>
-          <w:lang w:val="en-US"/>
-        </w:rPr>
-        <w:t xml:space="preserve"> (Pipa)</w:t>
-      </w:r>
-    </w:p>
-    <w:p>
-      <w:pPr>
-        <w:jc w:val="right"/>
-        <w:rPr>
-          <w:rFonts w:ascii="Noto Serif" w:eastAsia="Noto Serif SC" w:hAnsi="Noto Serif" w:cs="Noto Serif"/>
-          <w:sz w:val="24"/>
-          <w:szCs w:val="24"/>
-          <w:lang w:val="en-US"/>
-        </w:rPr>
-      </w:pPr>
-      <w:r>
-        <w:rPr>
-          <w:rFonts w:ascii="Noto Serif" w:eastAsia="Noto Serif SC" w:hAnsi="Noto Serif" w:cs="Noto Serif"/>
-          <w:sz w:val="24"/>
-          <w:szCs w:val="24"/>
-          <w:lang w:val="en-US"/>
-        </w:rPr>
-        <w:t>中阮</w:t>
-      </w:r>
-      <w:r>
-        <w:rPr>
-          <w:rFonts w:ascii="Noto Serif" w:eastAsia="Noto Serif SC" w:hAnsi="Noto Serif" w:cs="Noto Serif"/>
-          <w:sz w:val="24"/>
-          <w:szCs w:val="24"/>
-          <w:lang w:val="en-US"/>
-        </w:rPr>
-        <w:t xml:space="preserve"> (Zhongruan)</w:t>
-      </w:r>
-    </w:p>
-    <w:p>
-      <w:pPr>
-        <w:jc w:val="right"/>
-        <w:rPr>
-          <w:rFonts w:ascii="Noto Serif" w:eastAsia="Noto Serif SC" w:hAnsi="Noto Serif" w:cs="Noto Serif"/>
-          <w:sz w:val="24"/>
-          <w:szCs w:val="24"/>
-          <w:lang w:val="en-US"/>
-        </w:rPr>
-      </w:pPr>
-      <w:r>
-        <w:rPr>
-          <w:rFonts w:ascii="Noto Serif" w:eastAsia="Noto Serif SC" w:hAnsi="Noto Serif" w:cs="Noto Serif"/>
-          <w:sz w:val="24"/>
-          <w:szCs w:val="24"/>
-          <w:lang w:val="en-US"/>
-        </w:rPr>
-        <w:t>大阮</w:t>
-      </w:r>
-      <w:r>
-        <w:rPr>
-          <w:rFonts w:ascii="Noto Serif" w:eastAsia="Noto Serif SC" w:hAnsi="Noto Serif" w:cs="Noto Serif"/>
-          <w:sz w:val="24"/>
-          <w:szCs w:val="24"/>
-          <w:lang w:val="en-US"/>
-        </w:rPr>
-        <w:t xml:space="preserve"> (Daruan)</w:t>
-      </w:r>
-    </w:p>
-    <w:p>
-      <w:pPr>
-        <w:jc w:val="right"/>
-        <w:rPr>
-          <w:rFonts w:ascii="Noto Serif" w:eastAsia="Noto Serif SC" w:hAnsi="Noto Serif" w:cs="Noto Serif"/>
-          <w:sz w:val="24"/>
-          <w:szCs w:val="24"/>
-          <w:lang w:val="en-US"/>
-        </w:rPr>
-      </w:pPr>
-    </w:p>
-    <w:p>
-      <w:pPr>
-        <w:jc w:val="right"/>
-        <w:rPr>
-          <w:rFonts w:ascii="Noto Serif" w:eastAsia="Noto Serif SC" w:hAnsi="Noto Serif" w:cs="Noto Serif"/>
-          <w:sz w:val="24"/>
-          <w:szCs w:val="24"/>
-          <w:lang w:val="en-US"/>
-        </w:rPr>
-      </w:pPr>
-      <w:r>
-        <w:rPr>
-          <w:rFonts w:ascii="Noto Serif" w:eastAsia="Noto Serif SC" w:hAnsi="Noto Serif" w:cs="Noto Serif"/>
-          <w:sz w:val="24"/>
-          <w:szCs w:val="24"/>
-          <w:lang w:val="en-US"/>
-        </w:rPr>
-        <w:t>定音鼓</w:t>
-      </w:r>
-      <w:r>
-        <w:rPr>
-          <w:rFonts w:ascii="Noto Serif" w:eastAsia="Noto Serif SC" w:hAnsi="Noto Serif" w:cs="Noto Serif"/>
-          <w:sz w:val="24"/>
-          <w:szCs w:val="24"/>
-          <w:lang w:val="en-US"/>
-        </w:rPr>
-        <w:t xml:space="preserve"> (Timpani)</w:t>
-      </w:r>
-    </w:p>
-    <w:p>
-      <w:pPr>
-        <w:jc w:val="right"/>
-        <w:rPr>
-          <w:rFonts w:ascii="Noto Serif" w:eastAsia="Noto Serif SC" w:hAnsi="Noto Serif" w:cs="Noto Serif"/>
-          <w:sz w:val="24"/>
-          <w:szCs w:val="24"/>
-          <w:lang w:val="en-US"/>
-        </w:rPr>
-      </w:pPr>
-      <w:r>
-        <w:rPr>
-          <w:rFonts w:ascii="Noto Serif" w:eastAsia="Noto Serif SC" w:hAnsi="Noto Serif" w:cs="Noto Serif"/>
-          <w:sz w:val="24"/>
-          <w:szCs w:val="24"/>
-          <w:lang w:val="en-US"/>
-        </w:rPr>
-        <w:t>打击乐</w:t>
-      </w:r>
-      <w:r>
-        <w:rPr>
-          <w:rFonts w:ascii="Noto Serif" w:eastAsia="Noto Serif SC" w:hAnsi="Noto Serif" w:cs="Noto Serif"/>
-          <w:sz w:val="24"/>
-          <w:szCs w:val="24"/>
-          <w:lang w:val="en-US"/>
-        </w:rPr>
-        <w:t xml:space="preserve"> I (Percussion I): </w:t>
-      </w:r>
-      <w:r>
-        <w:rPr>
-          <w:rFonts w:ascii="Noto Serif" w:eastAsia="Noto Serif SC" w:hAnsi="Noto Serif" w:cs="Noto Serif"/>
-          <w:sz w:val="24"/>
-          <w:szCs w:val="24"/>
-        </w:rPr>
-        <w:t>中国大鼓</w:t>
-      </w:r>
-      <w:r>
-        <w:rPr>
-          <w:rFonts w:ascii="Noto Serif" w:eastAsia="Noto Serif SC" w:hAnsi="Noto Serif" w:cs="Noto Serif"/>
-          <w:sz w:val="24"/>
-          <w:szCs w:val="24"/>
-        </w:rPr>
-        <w:t xml:space="preserve"> (</w:t>
-      </w:r>
-      <w:proofErr w:type="spellStart"/>
-      <w:r>
-        <w:rPr>
-          <w:rFonts w:ascii="Noto Serif" w:eastAsia="Noto Serif SC" w:hAnsi="Noto Serif" w:cs="Noto Serif"/>
-          <w:sz w:val="24"/>
-          <w:szCs w:val="24"/>
-        </w:rPr>
-        <w:t>Zhongguo</w:t>
-      </w:r>
-      <w:proofErr w:type="spellEnd"/>
-      <w:r>
-        <w:rPr>
-          <w:rFonts w:ascii="Noto Serif" w:eastAsia="Noto Serif SC" w:hAnsi="Noto Serif" w:cs="Noto Serif"/>
-          <w:sz w:val="24"/>
-          <w:szCs w:val="24"/>
-        </w:rPr>
-        <w:t xml:space="preserve"> </w:t>
-      </w:r>
-      <w:proofErr w:type="spellStart"/>
-      <w:r>
-        <w:rPr>
-          <w:rFonts w:ascii="Noto Serif" w:eastAsia="Noto Serif SC" w:hAnsi="Noto Serif" w:cs="Noto Serif"/>
-          <w:sz w:val="24"/>
-          <w:szCs w:val="24"/>
-        </w:rPr>
-        <w:t>Dagu</w:t>
-      </w:r>
-      <w:proofErr w:type="spellEnd"/>
-      <w:r>
-        <w:rPr>
-          <w:rFonts w:ascii="Noto Serif" w:eastAsia="Noto Serif SC" w:hAnsi="Noto Serif" w:cs="Noto Serif"/>
-          <w:sz w:val="24"/>
-          <w:szCs w:val="24"/>
-        </w:rPr>
-        <w:t>)</w:t>
+        </w:rPr>
+        <w:t xml:space="preserve"> Dagu)</w:t>
       </w:r>
     </w:p>
     <w:p>
@@ -6054,25 +5888,7 @@
           <w:sz w:val="24"/>
           <w:szCs w:val="24"/>
         </w:rPr>
-        <w:t xml:space="preserve">, </w:t>
-      </w:r>
-      <w:proofErr w:type="spellStart"/>
-      <w:r>
-        <w:rPr>
-          <w:rFonts w:ascii="Noto Serif" w:eastAsia="Noto Serif SC" w:hAnsi="Noto Serif" w:cs="Noto Serif"/>
-          <w:sz w:val="24"/>
-          <w:szCs w:val="24"/>
-        </w:rPr>
-        <w:t>sed</w:t>
-      </w:r>
-      <w:proofErr w:type="spellEnd"/>
-      <w:r>
-        <w:rPr>
-          <w:rFonts w:ascii="Noto Serif" w:eastAsia="Noto Serif SC" w:hAnsi="Noto Serif" w:cs="Noto Serif"/>
-          <w:sz w:val="24"/>
-          <w:szCs w:val="24"/>
-        </w:rPr>
-        <w:t xml:space="preserve"> do </w:t>
+        <w:t xml:space="preserve">, sed do </w:t>
       </w:r>
       <w:proofErr w:type="spellStart"/>
       <w:r>

</xml_diff>